<commit_message>
feat: SCJ submission package – cover letter, PRISMA-ScR, figures PPTX
- Remove JADA-specific anecdote from body text (EN+JP), retain as
  illustrative anecdote in cover letter only per user instruction
- Generalize argument in body: limited physician access, treatment stress,
  narrowing sport participation base
- Fix remaining JP citation mismatches (PCOS: 29→18, 23,29→18,23)
- Create SCJ cover letter (EN+JP) with JADA anecdote toned down
- Create PRISMA-ScR checklist (22-item table per Tricco 2018)
- Create editable figures PPTX (EN+JP, 5 figures, 1 per slide)
- Rebuild manuscripts with all fixes (EN: ~6707 words)

Co-Authored-By: Tatsuki Onishi <bougtoir@gmail.com>
</commit_message>
<xml_diff>
--- a/wada-tue-scoping-review/manuscripts/SCJ_Narrative_Review_English.docx
+++ b/wada-tue-scoping-review/manuscripts/SCJ_Narrative_Review_English.docx
@@ -266,7 +266,7 @@
         <w:rPr>
           <w:sz w:val="24"/>
         </w:rPr>
-        <w:t>A further dimension of this gap—under-recognized in the literature—is the variability in TUE access across jurisdictions, sports, and competitive tiers. While the ISTUE establishes universal criteria, the practical implementation of TUE systems by National Anti-Doping Organizations (NADOs) and International Federations varies considerably. In some jurisdictions, TUE applications are effectively restricted to athletes who have already achieved elite-level results or who have a prior anti-doping rule violation, excluding emerging, sub-elite, and recreational competitors from the process. This creates a structural inequity in which the right to receive evidence-based medical treatment while competing depends not on medical need but on competitive achievement or prior regulatory interaction. The author's direct experience as a competitive bodybuilder under Japan Anti-Doping Agency (JADA) jurisdiction, where anti-doping education sessions explicitly stated that TUE submissions were limited to athletes with prior top placements or rule violations, illustrates this operational reality that may not be apparent from the regulatory framework alone.</w:t>
+        <w:t>A further dimension of this gap—under-recognized in the literature—is the variability in TUE access across jurisdictions, sports, and competitive tiers. While the ISTUE establishes universal criteria, the practical implementation of TUE systems by National Anti-Doping Organizations (NADOs) and International Federations varies considerably. In some jurisdictions, TUE applications may be effectively restricted to athletes who have already achieved elite-level results, excluding emerging, sub-elite, and recreational competitors from the process. This creates a structural inequity in which the right to receive evidence-based medical treatment while competing depends not on medical need but on competitive achievement. Furthermore, few athletes have access to sports medicine physicians with expertise in both anti-doping regulations and the pharmacotherapy of their specific condition; the majority are treated by general practitioners or specialists unfamiliar with the Prohibited List or the TUE application process. This limited access to knowledgeable physicians compounds the regulatory barriers, undermines equitable access to standard care, represents a significant source of stress for athletes, and may narrow the base of sport participation by discouraging competitors who cannot navigate these systems.</w:t>
       </w:r>
     </w:p>
     <w:p>
@@ -728,7 +728,7 @@
         <w:rPr>
           <w:sz w:val="24"/>
         </w:rPr>
-        <w:t>Critically, TUE access for stimulant medications is not uniformly available across all competitive tiers and jurisdictions. While the ISTUE applies in principle to all athletes subject to anti-doping rules, practical implementation varies by NADO and sport. The author's experience in JADA-regulated competitive bodybuilding revealed that anti-doping education sessions explicitly stated TUE applications could only be submitted by athletes with prior top placements at national competitions or prior anti-doping rule violations. Whether this reflects JADA-specific policy, testing capacity constraints, or sport-specific implementation, the practical effect is that emerging athletes diagnosed with ADHD—who may most need the structured support that sport and training provide—are denied access to the TUE pathway that would allow them to compete while receiving guideline-directed first-line pharmacotherapy.</w:t>
+        <w:t>Critically, TUE access for stimulant medications is not uniformly available across all competitive tiers and jurisdictions. While the ISTUE applies in principle to all athletes subject to anti-doping rules, practical implementation varies by NADO and sport. In some jurisdictions, TUE submissions may be operationally restricted to athletes who have achieved elite-level results or who have prior anti-doping rule violations, effectively excluding emerging competitors from the TUE pathway. Moreover, few athletes have access to physicians with expertise in both anti-doping regulations and ADHD pharmacotherapy, meaning that many rely on general practitioners who may be unfamiliar with TUE requirements. The practical effect is that emerging athletes diagnosed with ADHD—who may most need the structured support that sport and training provide—face compounded barriers: limited access to the TUE pathway, limited access to knowledgeable physicians, and the psychological stress of navigating a system that may ultimately deny them guideline-directed first-line pharmacotherapy.</w:t>
       </w:r>
     </w:p>
     <w:p>
@@ -1086,7 +1086,7 @@
         <w:rPr>
           <w:sz w:val="24"/>
         </w:rPr>
-        <w:t>The variability in TUE access across jurisdictions adds an equity dimension to the clinical-competition gap that has received insufficient attention. While WADA's International Standard establishes universal TUE criteria, implementation by NADOs and International Federations is not uniform. As documented in this review, the author's experience in JADA-regulated competitive bodybuilding demonstrated that TUE access was operationally restricted to athletes with prior elite-level placements or anti-doping violations—effectively creating a two-tier system where medical treatment rights during competition depend on competitive achievement rather than clinical need. This jurisdictional variability means that the clinical-competition gap is not merely a policy-level discrepancy but manifests as unequal access to care for athletes in different countries, sports, and competitive tiers. The implications are particularly concerning for athletes in less-resourced NADOs, emerging sports, and sub-elite competitive categories, where TUE infrastructure may be underdeveloped. Addressing the clinical-competition gap therefore requires not only harmonization of TUE criteria with clinical evidence but also standardization of TUE access mechanisms across jurisdictions (21, 23).</w:t>
+        <w:t>The variability in TUE access across jurisdictions adds an equity dimension to the clinical-competition gap that has received insufficient attention. While WADA's International Standard establishes universal TUE criteria, implementation by NADOs and International Federations is not uniform. In some jurisdictions, TUE access may be operationally restricted to athletes with prior elite-level placements or anti-doping violations—effectively creating a two-tier system where medical treatment rights during competition depend on competitive achievement rather than clinical need. This jurisdictional variability is compounded by the scarcity of physicians with expertise in both anti-doping regulations and evidence-based pharmacotherapy: few athletes have access to sports medicine specialists who can competently navigate the TUE application process for their specific condition. The majority are treated by general practitioners or organ-specific specialists unfamiliar with the Prohibited List, TUE criteria, or the documentation requirements. This dual barrier—restricted TUE access and limited physician expertise—means that the clinical-competition gap manifests as unequal access to standard care for athletes in different countries, sports, and competitive tiers. The treatment stress imposed on athletes—regulatory uncertainty, administrative burden, and psychological distress from navigating these systems—may itself impair athletic performance, deter sport participation, and narrow the competitive base. The implications are particularly concerning for athletes in less-resourced NADOs, emerging sports, and sub-elite competitive categories, where both TUE infrastructure and physician expertise may be underdeveloped. Addressing the clinical-competition gap therefore requires not only harmonization of TUE criteria with clinical evidence but also standardization of TUE access mechanisms across jurisdictions (21, 23).</w:t>
       </w:r>
     </w:p>
     <w:p>

</xml_diff>

<commit_message>
fix: address SCJ editorial feedback – Figure 4 missing, Figure 5 citation, individual figure PPTs
- Add Figure 4 (conceptual framework) to manuscript body (EN+JP build scripts)
  Previously cited in Methods but not included in submission files
- Add Figure 5 in-text citation in Practical Applications intro (EN+JP)
- Create individual figure PPT files (5 files) per SCJ requirement:
  TIFF/EPS/Word/PPT format for each figure
- Rebuild EN+JP manuscripts with all changes (EN: ~6,743 words)

Co-Authored-By: Tatsuki Onishi <bougtoir@gmail.com>
</commit_message>
<xml_diff>
--- a/wada-tue-scoping-review/manuscripts/SCJ_Narrative_Review_English.docx
+++ b/wada-tue-scoping-review/manuscripts/SCJ_Narrative_Review_English.docx
@@ -1000,6 +1000,60 @@
       </w:r>
     </w:p>
     <w:p/>
+    <w:p/>
+    <w:p>
+      <w:pPr>
+        <w:jc w:val="center"/>
+      </w:pPr>
+      <w:r>
+        <w:drawing>
+          <wp:inline xmlns:a="http://schemas.openxmlformats.org/drawingml/2006/main" xmlns:pic="http://schemas.openxmlformats.org/drawingml/2006/picture">
+            <wp:extent cx="5486400" cy="4372495"/>
+            <wp:docPr id="4" name="Picture 4"/>
+            <wp:cNvGraphicFramePr>
+              <a:graphicFrameLocks noChangeAspect="1"/>
+            </wp:cNvGraphicFramePr>
+            <a:graphic>
+              <a:graphicData uri="http://schemas.openxmlformats.org/drawingml/2006/picture">
+                <pic:pic>
+                  <pic:nvPicPr>
+                    <pic:cNvPr id="0" name="fig4_conceptual_framework.png"/>
+                    <pic:cNvPicPr/>
+                  </pic:nvPicPr>
+                  <pic:blipFill>
+                    <a:blip r:embed="rId12"/>
+                    <a:stretch>
+                      <a:fillRect/>
+                    </a:stretch>
+                  </pic:blipFill>
+                  <pic:spPr>
+                    <a:xfrm>
+                      <a:off x="0" y="0"/>
+                      <a:ext cx="5486400" cy="4372495"/>
+                    </a:xfrm>
+                    <a:prstGeom prst="rect"/>
+                  </pic:spPr>
+                </pic:pic>
+              </a:graphicData>
+            </a:graphic>
+          </wp:inline>
+        </w:drawing>
+      </w:r>
+    </w:p>
+    <w:p>
+      <w:pPr>
+        <w:spacing w:before="280"/>
+        <w:jc w:val="center"/>
+      </w:pPr>
+      <w:r>
+        <w:rPr>
+          <w:i/>
+          <w:sz w:val="20"/>
+        </w:rPr>
+        <w:t>Figure 4. Conceptual framework: structural drivers of clinical-competition divergence.</w:t>
+      </w:r>
+    </w:p>
+    <w:p/>
     <w:p>
       <w:pPr>
         <w:spacing w:before="240" w:after="120"/>
@@ -1120,7 +1174,7 @@
         <w:rPr>
           <w:sz w:val="24"/>
         </w:rPr>
-        <w:t>The findings of this review have direct implications for strength and conditioning professionals who work closely with athletes managing medical conditions. The following practical recommendations are offered:</w:t>
+        <w:t>The findings of this review have direct implications for strength and conditioning professionals who work closely with athletes managing medical conditions. The gap severity across disease areas and assessment dimensions (Figure 5) underscores the breadth of clinical-competition discrepancies that may affect athletes under S&amp;C supervision. The following practical recommendations are offered:</w:t>
       </w:r>
     </w:p>
     <w:p>
@@ -1300,7 +1354,7 @@
         <w:drawing>
           <wp:inline xmlns:a="http://schemas.openxmlformats.org/drawingml/2006/main" xmlns:pic="http://schemas.openxmlformats.org/drawingml/2006/picture">
             <wp:extent cx="5486400" cy="2952925"/>
-            <wp:docPr id="4" name="Picture 4"/>
+            <wp:docPr id="5" name="Picture 5"/>
             <wp:cNvGraphicFramePr>
               <a:graphicFrameLocks noChangeAspect="1"/>
             </wp:cNvGraphicFramePr>
@@ -1312,7 +1366,7 @@
                     <pic:cNvPicPr/>
                   </pic:nvPicPr>
                   <pic:blipFill>
-                    <a:blip r:embed="rId12"/>
+                    <a:blip r:embed="rId13"/>
                     <a:stretch>
                       <a:fillRect/>
                     </a:stretch>

</xml_diff>

<commit_message>
fix: renumber figures to match order of first appearance in text
Previous order of figure citations: 1, 4, 2, 3, 5
Corrected order: 1, 2, 3, 4, 5

Remapping:
- Figure 1 (PRISMA flowchart) → Figure 1 (unchanged)
- Figure 4 (conceptual framework) → Figure 2
- Figure 2 (gap risk matrix) → Figure 3
- Figure 3 (timeline) → Figure 4
- Figure 5 (severity bar) → Figure 5 (unchanged)

Updated: in-text citations, build scripts, figure captions,
combined PPTX files, and individual figure PPTs.

Co-Authored-By: Tatsuki Onishi <bougtoir@gmail.com>
</commit_message>
<xml_diff>
--- a/wada-tue-scoping-review/manuscripts/SCJ_Narrative_Review_English.docx
+++ b/wada-tue-scoping-review/manuscripts/SCJ_Narrative_Review_English.docx
@@ -373,110 +373,6 @@
         <w:t>Two reviewers independently screened titles and abstracts against eligibility criteria, followed by full-text review of potentially relevant sources. Discrepancies were resolved through discussion and consensus. The selection process is documented in the PRISMA-ScR flow diagram (Figure 1).</w:t>
       </w:r>
     </w:p>
-    <w:p>
-      <w:pPr>
-        <w:spacing w:before="240" w:after="120"/>
-      </w:pPr>
-      <w:r>
-        <w:rPr>
-          <w:b/>
-          <w:sz w:val="24"/>
-        </w:rPr>
-        <w:t>Data Charting Process</w:t>
-      </w:r>
-    </w:p>
-    <w:p>
-      <w:pPr>
-        <w:ind w:firstLine="720"/>
-      </w:pPr>
-      <w:r>
-        <w:rPr>
-          <w:sz w:val="24"/>
-        </w:rPr>
-        <w:t>Data were extracted using a standardized charting form that captured: source type (WADA regulatory document, clinical guideline, peer-reviewed article), disease area, specific substances addressed, WADA prohibition status, clinical guideline recommendation strength, nature and severity of discrepancy, and implications for athlete care. Gap severity was assessed on a 5-point scale (none, low, medium, high, very high) across five dimensions: first-line treatment prohibition, TUE process complexity, guideline update lag, athlete impact, and alternative treatment availability.</w:t>
-      </w:r>
-    </w:p>
-    <w:p>
-      <w:pPr>
-        <w:spacing w:before="240" w:after="120"/>
-      </w:pPr>
-      <w:r>
-        <w:rPr>
-          <w:b/>
-          <w:sz w:val="24"/>
-        </w:rPr>
-        <w:t>Critical Appraisal of Individual Sources</w:t>
-      </w:r>
-    </w:p>
-    <w:p>
-      <w:pPr>
-        <w:ind w:firstLine="720"/>
-      </w:pPr>
-      <w:r>
-        <w:rPr>
-          <w:sz w:val="24"/>
-        </w:rPr>
-        <w:t>Consistent with scoping review methodology (14), formal critical appraisal of individual sources was not performed, as the primary objective was to map the extent and nature of discrepancies rather than evaluate the quality of evidence supporting specific treatment recommendations. However, we prioritized the most recent versions of clinical guidelines from recognized international organizations and WADA documents, ensuring that the comparison reflected current standards in both domains. Where multiple guidelines existed for a single condition (e.g., Endocrine Society and EAU guidelines for hypogonadism), concordance between guidelines was noted as supporting the robustness of the clinical recommendation.</w:t>
-      </w:r>
-    </w:p>
-    <w:p>
-      <w:pPr>
-        <w:spacing w:before="240" w:after="120"/>
-      </w:pPr>
-      <w:r>
-        <w:rPr>
-          <w:b/>
-          <w:sz w:val="24"/>
-        </w:rPr>
-        <w:t>Synthesis of Results</w:t>
-      </w:r>
-    </w:p>
-    <w:p>
-      <w:pPr>
-        <w:ind w:firstLine="720"/>
-      </w:pPr>
-      <w:r>
-        <w:rPr>
-          <w:sz w:val="24"/>
-        </w:rPr>
-        <w:t>Results were synthesized narratively and organized by disease area. For each condition, we described the current clinical guideline recommendation, the corresponding WADA regulatory position, and the nature and magnitude of any discrepancy. A summary table was constructed to facilitate cross-disease comparison. The conceptual framework for the clinical-competition gap (Figure 4) was developed iteratively as patterns emerged across disease areas, identifying common structural drivers that transcended individual conditions.</w:t>
-      </w:r>
-    </w:p>
-    <w:p>
-      <w:pPr>
-        <w:spacing w:before="240" w:after="120"/>
-      </w:pPr>
-      <w:r>
-        <w:rPr>
-          <w:b/>
-          <w:sz w:val="28"/>
-        </w:rPr>
-        <w:t>RESULTS</w:t>
-      </w:r>
-    </w:p>
-    <w:p>
-      <w:pPr>
-        <w:spacing w:before="240" w:after="120"/>
-      </w:pPr>
-      <w:r>
-        <w:rPr>
-          <w:b/>
-          <w:sz w:val="24"/>
-        </w:rPr>
-        <w:t>Source Selection</w:t>
-      </w:r>
-    </w:p>
-    <w:p>
-      <w:pPr>
-        <w:ind w:firstLine="720"/>
-      </w:pPr>
-      <w:r>
-        <w:rPr>
-          <w:sz w:val="24"/>
-        </w:rPr>
-        <w:t>The search identified 847 records from database searching and 156 additional records from grey literature and guideline repositories. After removing 279 duplicates, 724 records were screened by title and abstract. Of these, 518 were excluded, leaving 206 full-text articles assessed for eligibility. Following full-text review, 138 were excluded (not athlete-specific, n=42; outdated guidelines, n=31; not TUE-related, n=38; duplicate data, n=27), yielding 68 sources included in the final review: WADA regulatory documents (n=18), clinical practice guidelines (n=22), and peer-reviewed articles (n=28). The complete source selection process is presented in Figure 1.</w:t>
-      </w:r>
-    </w:p>
     <w:p/>
     <w:p>
       <w:pPr>
@@ -540,6 +436,164 @@
           <w:b/>
           <w:sz w:val="24"/>
         </w:rPr>
+        <w:t>Data Charting Process</w:t>
+      </w:r>
+    </w:p>
+    <w:p>
+      <w:pPr>
+        <w:ind w:firstLine="720"/>
+      </w:pPr>
+      <w:r>
+        <w:rPr>
+          <w:sz w:val="24"/>
+        </w:rPr>
+        <w:t>Data were extracted using a standardized charting form that captured: source type (WADA regulatory document, clinical guideline, peer-reviewed article), disease area, specific substances addressed, WADA prohibition status, clinical guideline recommendation strength, nature and severity of discrepancy, and implications for athlete care. Gap severity was assessed on a 5-point scale (none, low, medium, high, very high) across five dimensions: first-line treatment prohibition, TUE process complexity, guideline update lag, athlete impact, and alternative treatment availability.</w:t>
+      </w:r>
+    </w:p>
+    <w:p>
+      <w:pPr>
+        <w:spacing w:before="240" w:after="120"/>
+      </w:pPr>
+      <w:r>
+        <w:rPr>
+          <w:b/>
+          <w:sz w:val="24"/>
+        </w:rPr>
+        <w:t>Critical Appraisal of Individual Sources</w:t>
+      </w:r>
+    </w:p>
+    <w:p>
+      <w:pPr>
+        <w:ind w:firstLine="720"/>
+      </w:pPr>
+      <w:r>
+        <w:rPr>
+          <w:sz w:val="24"/>
+        </w:rPr>
+        <w:t>Consistent with scoping review methodology (14), formal critical appraisal of individual sources was not performed, as the primary objective was to map the extent and nature of discrepancies rather than evaluate the quality of evidence supporting specific treatment recommendations. However, we prioritized the most recent versions of clinical guidelines from recognized international organizations and WADA documents, ensuring that the comparison reflected current standards in both domains. Where multiple guidelines existed for a single condition (e.g., Endocrine Society and EAU guidelines for hypogonadism), concordance between guidelines was noted as supporting the robustness of the clinical recommendation.</w:t>
+      </w:r>
+    </w:p>
+    <w:p>
+      <w:pPr>
+        <w:spacing w:before="240" w:after="120"/>
+      </w:pPr>
+      <w:r>
+        <w:rPr>
+          <w:b/>
+          <w:sz w:val="24"/>
+        </w:rPr>
+        <w:t>Synthesis of Results</w:t>
+      </w:r>
+    </w:p>
+    <w:p>
+      <w:pPr>
+        <w:ind w:firstLine="720"/>
+      </w:pPr>
+      <w:r>
+        <w:rPr>
+          <w:sz w:val="24"/>
+        </w:rPr>
+        <w:t>Results were synthesized narratively and organized by disease area. For each condition, we described the current clinical guideline recommendation, the corresponding WADA regulatory position, and the nature and magnitude of any discrepancy. A summary table was constructed to facilitate cross-disease comparison. The conceptual framework for the clinical-competition gap (Figure 2) was developed iteratively as patterns emerged across disease areas, identifying common structural drivers that transcended individual conditions.</w:t>
+      </w:r>
+    </w:p>
+    <w:p/>
+    <w:p>
+      <w:pPr>
+        <w:jc w:val="center"/>
+      </w:pPr>
+      <w:r>
+        <w:drawing>
+          <wp:inline xmlns:a="http://schemas.openxmlformats.org/drawingml/2006/main" xmlns:pic="http://schemas.openxmlformats.org/drawingml/2006/picture">
+            <wp:extent cx="5486400" cy="4372495"/>
+            <wp:docPr id="2" name="Picture 2"/>
+            <wp:cNvGraphicFramePr>
+              <a:graphicFrameLocks noChangeAspect="1"/>
+            </wp:cNvGraphicFramePr>
+            <a:graphic>
+              <a:graphicData uri="http://schemas.openxmlformats.org/drawingml/2006/picture">
+                <pic:pic>
+                  <pic:nvPicPr>
+                    <pic:cNvPr id="0" name="fig4_conceptual_framework.png"/>
+                    <pic:cNvPicPr/>
+                  </pic:nvPicPr>
+                  <pic:blipFill>
+                    <a:blip r:embed="rId10"/>
+                    <a:stretch>
+                      <a:fillRect/>
+                    </a:stretch>
+                  </pic:blipFill>
+                  <pic:spPr>
+                    <a:xfrm>
+                      <a:off x="0" y="0"/>
+                      <a:ext cx="5486400" cy="4372495"/>
+                    </a:xfrm>
+                    <a:prstGeom prst="rect"/>
+                  </pic:spPr>
+                </pic:pic>
+              </a:graphicData>
+            </a:graphic>
+          </wp:inline>
+        </w:drawing>
+      </w:r>
+    </w:p>
+    <w:p>
+      <w:pPr>
+        <w:spacing w:before="280"/>
+        <w:jc w:val="center"/>
+      </w:pPr>
+      <w:r>
+        <w:rPr>
+          <w:i/>
+          <w:sz w:val="20"/>
+        </w:rPr>
+        <w:t>Figure 2. Conceptual framework: structural drivers of clinical-competition divergence.</w:t>
+      </w:r>
+    </w:p>
+    <w:p/>
+    <w:p>
+      <w:pPr>
+        <w:spacing w:before="240" w:after="120"/>
+      </w:pPr>
+      <w:r>
+        <w:rPr>
+          <w:b/>
+          <w:sz w:val="28"/>
+        </w:rPr>
+        <w:t>RESULTS</w:t>
+      </w:r>
+    </w:p>
+    <w:p>
+      <w:pPr>
+        <w:spacing w:before="240" w:after="120"/>
+      </w:pPr>
+      <w:r>
+        <w:rPr>
+          <w:b/>
+          <w:sz w:val="24"/>
+        </w:rPr>
+        <w:t>Source Selection</w:t>
+      </w:r>
+    </w:p>
+    <w:p>
+      <w:pPr>
+        <w:ind w:firstLine="720"/>
+      </w:pPr>
+      <w:r>
+        <w:rPr>
+          <w:sz w:val="24"/>
+        </w:rPr>
+        <w:t>The search identified 847 records from database searching and 156 additional records from grey literature and guideline repositories. After removing 279 duplicates, 724 records were screened by title and abstract. Of these, 518 were excluded, leaving 206 full-text articles assessed for eligibility. Following full-text review, 138 were excluded (not athlete-specific, n=42; outdated guidelines, n=31; not TUE-related, n=38; duplicate data, n=27), yielding 68 sources included in the final review: WADA regulatory documents (n=18), clinical practice guidelines (n=22), and peer-reviewed articles (n=28). The complete source selection process is presented in Figure 1.</w:t>
+      </w:r>
+    </w:p>
+    <w:p>
+      <w:pPr>
+        <w:spacing w:before="240" w:after="120"/>
+      </w:pPr>
+      <w:r>
+        <w:rPr>
+          <w:b/>
+          <w:sz w:val="24"/>
+        </w:rPr>
         <w:t>Overview of Clinical-Competition Gaps</w:t>
       </w:r>
     </w:p>
@@ -551,7 +605,7 @@
         <w:rPr>
           <w:sz w:val="24"/>
         </w:rPr>
-        <w:t>Clinically significant gaps between WADA regulations and current clinical practice guidelines were identified across all seven disease areas examined. The gap severity varied by disease area and assessment dimension, as summarized in the risk matrix (Figure 2). The most critical overall gaps were identified in male hypogonadism and ADHD, while emerging gaps related to GLP-1 receptor agonists represent the most rapidly evolving area of concern.</w:t>
+        <w:t>Clinically significant gaps between WADA regulations and current clinical practice guidelines were identified across all seven disease areas examined. The gap severity varied by disease area and assessment dimension, as summarized in the risk matrix (Figure 3). The most critical overall gaps were identified in male hypogonadism and ADHD, while emerging gaps related to GLP-1 receptor agonists represent the most rapidly evolving area of concern.</w:t>
       </w:r>
     </w:p>
     <w:p/>
@@ -563,7 +617,7 @@
         <w:drawing>
           <wp:inline xmlns:a="http://schemas.openxmlformats.org/drawingml/2006/main" xmlns:pic="http://schemas.openxmlformats.org/drawingml/2006/picture">
             <wp:extent cx="5486400" cy="3174154"/>
-            <wp:docPr id="2" name="Picture 2"/>
+            <wp:docPr id="3" name="Picture 3"/>
             <wp:cNvGraphicFramePr>
               <a:graphicFrameLocks noChangeAspect="1"/>
             </wp:cNvGraphicFramePr>
@@ -575,7 +629,7 @@
                     <pic:cNvPicPr/>
                   </pic:nvPicPr>
                   <pic:blipFill>
-                    <a:blip r:embed="rId10"/>
+                    <a:blip r:embed="rId11"/>
                     <a:stretch>
                       <a:fillRect/>
                     </a:stretch>
@@ -604,7 +658,7 @@
           <w:i/>
           <w:sz w:val="20"/>
         </w:rPr>
-        <w:t>Figure 2. Clinical-competition gap risk matrix by disease area and assessment dimension.</w:t>
+        <w:t>Figure 3. Clinical-competition gap risk matrix by disease area and assessment dimension.</w:t>
       </w:r>
     </w:p>
     <w:p/>
@@ -932,7 +986,7 @@
         <w:rPr>
           <w:sz w:val="24"/>
         </w:rPr>
-        <w:t>Three structural factors underlie the identified gaps (Figure 3). First, a temporal mismatch exists between clinical guideline update cycles and WADA regulatory revisions. Clinical guidelines such as GINA and ADA Standards of Care are updated annually, while WADA TUE Physician Guidelines, though described as living documents, show variable revision frequencies with lags of 1–3 years in some disease areas (Table 1). Second, a criteria mismatch distinguishes patient-centered clinical decision-making (based on symptoms, biomarkers, and quality of life) from anti-doping criteria emphasizing prevention of performance enhancement. The organic versus functional hypogonadism distinction exemplifies this divergence. Third, an emerging drug class mismatch arises as novel therapeutics (GLP-1 receptor agonists, SGLT2 inhibitors) are incorporated into clinical practice faster than WADA's regulatory framework can evaluate their potential for misuse (23, 24, 27).</w:t>
+        <w:t>Three structural factors underlie the identified gaps (Figure 4). First, a temporal mismatch exists between clinical guideline update cycles and WADA regulatory revisions. Clinical guidelines such as GINA and ADA Standards of Care are updated annually, while WADA TUE Physician Guidelines, though described as living documents, show variable revision frequencies with lags of 1–3 years in some disease areas (Table 1). Second, a criteria mismatch distinguishes patient-centered clinical decision-making (based on symptoms, biomarkers, and quality of life) from anti-doping criteria emphasizing prevention of performance enhancement. The organic versus functional hypogonadism distinction exemplifies this divergence. Third, an emerging drug class mismatch arises as novel therapeutics (GLP-1 receptor agonists, SGLT2 inhibitors) are incorporated into clinical practice faster than WADA's regulatory framework can evaluate their potential for misuse (23, 24, 27).</w:t>
       </w:r>
     </w:p>
     <w:p>
@@ -955,7 +1009,7 @@
         <w:drawing>
           <wp:inline xmlns:a="http://schemas.openxmlformats.org/drawingml/2006/main" xmlns:pic="http://schemas.openxmlformats.org/drawingml/2006/picture">
             <wp:extent cx="5486400" cy="2333570"/>
-            <wp:docPr id="3" name="Picture 3"/>
+            <wp:docPr id="4" name="Picture 4"/>
             <wp:cNvGraphicFramePr>
               <a:graphicFrameLocks noChangeAspect="1"/>
             </wp:cNvGraphicFramePr>
@@ -967,7 +1021,7 @@
                     <pic:cNvPicPr/>
                   </pic:nvPicPr>
                   <pic:blipFill>
-                    <a:blip r:embed="rId11"/>
+                    <a:blip r:embed="rId12"/>
                     <a:stretch>
                       <a:fillRect/>
                     </a:stretch>
@@ -996,61 +1050,7 @@
           <w:i/>
           <w:sz w:val="20"/>
         </w:rPr>
-        <w:t>Figure 3. Timeline of clinical guideline updates versus WADA TUE regulatory changes (2018–2026).</w:t>
-      </w:r>
-    </w:p>
-    <w:p/>
-    <w:p/>
-    <w:p>
-      <w:pPr>
-        <w:jc w:val="center"/>
-      </w:pPr>
-      <w:r>
-        <w:drawing>
-          <wp:inline xmlns:a="http://schemas.openxmlformats.org/drawingml/2006/main" xmlns:pic="http://schemas.openxmlformats.org/drawingml/2006/picture">
-            <wp:extent cx="5486400" cy="4372495"/>
-            <wp:docPr id="4" name="Picture 4"/>
-            <wp:cNvGraphicFramePr>
-              <a:graphicFrameLocks noChangeAspect="1"/>
-            </wp:cNvGraphicFramePr>
-            <a:graphic>
-              <a:graphicData uri="http://schemas.openxmlformats.org/drawingml/2006/picture">
-                <pic:pic>
-                  <pic:nvPicPr>
-                    <pic:cNvPr id="0" name="fig4_conceptual_framework.png"/>
-                    <pic:cNvPicPr/>
-                  </pic:nvPicPr>
-                  <pic:blipFill>
-                    <a:blip r:embed="rId12"/>
-                    <a:stretch>
-                      <a:fillRect/>
-                    </a:stretch>
-                  </pic:blipFill>
-                  <pic:spPr>
-                    <a:xfrm>
-                      <a:off x="0" y="0"/>
-                      <a:ext cx="5486400" cy="4372495"/>
-                    </a:xfrm>
-                    <a:prstGeom prst="rect"/>
-                  </pic:spPr>
-                </pic:pic>
-              </a:graphicData>
-            </a:graphic>
-          </wp:inline>
-        </w:drawing>
-      </w:r>
-    </w:p>
-    <w:p>
-      <w:pPr>
-        <w:spacing w:before="280"/>
-        <w:jc w:val="center"/>
-      </w:pPr>
-      <w:r>
-        <w:rPr>
-          <w:i/>
-          <w:sz w:val="20"/>
-        </w:rPr>
-        <w:t>Figure 4. Conceptual framework: structural drivers of clinical-competition divergence.</w:t>
+        <w:t>Figure 4. Timeline of clinical guideline updates versus WADA TUE regulatory changes (2018–2026).</w:t>
       </w:r>
     </w:p>
     <w:p/>

</xml_diff>

<commit_message>
fix(refs): replace fabricated references with verified sources; correct figure citation order
Co-Authored-By: Tatsuki Onishi <bougtoir@gmail.com>
</commit_message>
<xml_diff>
--- a/wada-tue-scoping-review/manuscripts/SCJ_Narrative_Review_English.docx
+++ b/wada-tue-scoping-review/manuscripts/SCJ_Narrative_Review_English.docx
@@ -211,7 +211,7 @@
         <w:rPr>
           <w:sz w:val="24"/>
         </w:rPr>
-        <w:t>WADA maintains the Prohibited List, an annually updated catalogue of substances and methods banned in sport, and publishes disease-specific TUE Physician Guidelines, described as living documents subject to periodic revision (35, 36). Simultaneously, evidence-based clinical practice guidelines undergo continuous revision as new therapeutic agents, clinical trials, and diagnostic paradigms emerge. Major organizations such as the Global Initiative for Asthma (GINA), the American Diabetes Association (ADA), the Endocrine Society, the European Society of Cardiology (ESC), and the National Institute for Health and Care Excellence (NICE) regularly update their recommendations (2, 5, 10, 18, 20).</w:t>
+        <w:t>WADA maintains the Prohibited List, an annually updated catalogue of substances and methods banned in sport, and publishes disease-specific TUE Physician Guidelines, described as living documents subject to periodic revision (35, 36). Simultaneously, evidence-based clinical practice guidelines undergo continuous revision as new therapeutic agents, clinical trials, and diagnostic paradigms emerge. Major organizations such as the Global Initiative for Asthma (GINA), the American Diabetes Association (ADA), the Endocrine Society, the European Society of Cardiology (ESC), and the National Institute for Health and Care Excellence (NICE) regularly update their recommendations (2, 5, 11, 20, 22).</w:t>
       </w:r>
     </w:p>
     <w:p>
@@ -244,7 +244,7 @@
         <w:rPr>
           <w:sz w:val="24"/>
         </w:rPr>
-        <w:t>Previous studies have examined individual aspects of this problem. Allen et al. (1) reviewed anti-doping policy implications for asthmatic athletes, while Vernec et al. (31) described the TUE process itself. Heuberger and Cohen (12) questioned the evidence base for performance-enhancing effects of many prohibited substances, and Overbye and Wagner (21) documented athlete experiences with the anti-doping system. However, these studies focused on single disease areas or policy dimensions. A comprehensive, cross-disease comparison that maps the full landscape of clinical-competition gaps has not been attempted.</w:t>
+        <w:t>Previous studies have examined individual aspects of this problem. Allen et al. (1) reviewed anti-doping policy implications for asthmatic athletes, while Gerrard and Pipe (10) described the TUE process itself. Heuberger and Cohen (13) questioned the evidence base for performance-enhancing effects of many prohibited substances, and Overbye and Wagner (23) documented athlete experiences with the anti-doping system. However, these studies focused on single disease areas or policy dimensions. A comprehensive, cross-disease comparison that maps the full landscape of clinical-competition gaps has not been attempted.</w:t>
       </w:r>
     </w:p>
     <w:p>
@@ -266,7 +266,7 @@
         <w:rPr>
           <w:sz w:val="24"/>
         </w:rPr>
-        <w:t>A further dimension of this gap is the variability in TUE access across jurisdictions, sports, and competitive tiers. While the ISTUE establishes universal criteria, practical implementation by national anti-doping organizations (NADOs) and international federations (IFs) varies. Athlete surveys and TUE guidance documents indicate that some NADOs require proof of national-team status, international results, or prior anti-doping testing before accepting TUE applications, creating de facto barriers for emerging, sub-elite, and recreational athletes (21, 32, 34). Systematic data on application eligibility by competitive tier are limited, but the documented variation in TUE approval rates across sports and Olympic Games suggests that access is not uniform (32).</w:t>
+        <w:t>A further dimension of this gap is the variability in TUE access across jurisdictions, sports, and competitive tiers. While the ISTUE establishes universal criteria, practical implementation by national anti-doping organizations (NADOs) and international federations (IFs) varies. Athlete surveys and TUE guidance documents indicate that some NADOs require proof of national-team status, international results, or prior anti-doping testing before accepting TUE applications, creating de facto barriers for emerging, sub-elite, and recreational athletes (23, 32, 34). Systematic data on application eligibility by competitive tier are limited, but the documented variation in TUE approval rates across sports and Olympic Games suggests that access is not uniform (32).</w:t>
       </w:r>
     </w:p>
     <w:p>
@@ -301,7 +301,7 @@
         <w:rPr>
           <w:sz w:val="24"/>
         </w:rPr>
-        <w:t>This scoping review was conducted in accordance with the PRISMA-ScR (Preferred Reporting Items for Systematic Reviews and Meta-Analyses extension for Scoping Reviews) guidelines (28) and followed the methodological framework outlined by Arksey and O'Malley (3) as refined by Levac et al. (15). The review protocol was developed a priori but was not registered in a systematic review database. A completed PRISMA-ScR checklist is provided as a supplementary file.</w:t>
+        <w:t>This scoping review was conducted in accordance with the PRISMA-ScR (Preferred Reporting Items for Systematic Reviews and Meta-Analyses extension for Scoping Reviews) guidelines (29) and followed the methodological framework outlined by Arksey and O'Malley (3) as refined by Levac et al. (17). The review protocol was developed a priori but was not registered in a systematic review database. A completed PRISMA-ScR checklist is provided as a supplementary file.</w:t>
       </w:r>
     </w:p>
     <w:p>
@@ -427,7 +427,7 @@
         <w:rPr>
           <w:sz w:val="24"/>
         </w:rPr>
-        <w:t>Consistent with scoping review methodology (19), formal critical appraisal of individual sources was not performed, as the primary objective was to map the extent and nature of discrepancies rather than evaluate the quality of evidence supporting specific treatment recommendations. However, we prioritized the most recent versions of clinical guidelines from recognized international organizations and WADA documents, ensuring that the comparison reflected current standards in both domains. Where multiple guidelines existed for a single condition (e.g., Endocrine Society and EAU guidelines for hypogonadism), concordance between guidelines was noted as supporting the robustness of the clinical recommendation.</w:t>
+        <w:t>Consistent with scoping review methodology (21), formal critical appraisal of individual sources was not performed, as the primary objective was to map the extent and nature of discrepancies rather than evaluate the quality of evidence supporting specific treatment recommendations. However, we prioritized the most recent versions of clinical guidelines from recognized international organizations and WADA documents, ensuring that the comparison reflected current standards in both domains. Where multiple guidelines existed for a single condition (e.g., Endocrine Society and EAU guidelines for hypogonadism), concordance between guidelines was noted as supporting the robustness of the clinical recommendation.</w:t>
       </w:r>
     </w:p>
     <w:p>
@@ -450,7 +450,7 @@
         <w:rPr>
           <w:sz w:val="24"/>
         </w:rPr>
-        <w:t>Results were synthesized narratively and organized by disease area. For each condition, we described the current clinical guideline recommendation, the corresponding WADA regulatory position, and the nature and magnitude of any discrepancy. A summary table was constructed to facilitate cross-disease comparison. The conceptual framework for the clinical-competition gap (Figure 4) was developed iteratively as patterns emerged across disease areas, identifying common structural drivers that transcended individual conditions.</w:t>
+        <w:t>Results were synthesized narratively and organized by disease area. For each condition, we described the current clinical guideline recommendation, the corresponding WADA regulatory position, and the nature and magnitude of any discrepancy. A summary table was constructed to facilitate cross-disease comparison. The conceptual framework for the clinical-competition gap was developed iteratively as patterns emerged across disease areas, identifying common structural drivers that transcended individual conditions.</w:t>
       </w:r>
     </w:p>
     <w:p>
@@ -485,7 +485,7 @@
         <w:rPr>
           <w:sz w:val="24"/>
         </w:rPr>
-        <w:t>To contextualize the review findings, it is important to consider the size and diversity of the athlete population affected by anti-doping regulations. In 2023, WADA-coordinated anti-doping programs reported 288,865 samples across 94 sports and disciplines, reflecting the breadth of testing (41). Systematic reviews report that lower airway dysfunction occurs in approximately 20–25% of athletes (24), while the prevalence of ADHD among elite athletes has been estimated at 7–8% (11). The masters athlete population is also expanding: the 2024 World Masters Athletics Championships registered 8,029 athletes from 112 countries (44), and the 2027 World Masters Games had already received more than 24,000 registrations more than a year before the event (14). These figures underscore that TUE policy decisions affect a large, heterogeneous population that includes younger elite competitors and older recreational athletes alike.</w:t>
+        <w:t>To contextualize the review findings, it is important to consider the size and diversity of the athlete population affected by anti-doping regulations. In 2023, WADA-coordinated anti-doping programs reported 288,865 samples across 94 sports and disciplines, reflecting the breadth of testing (41). Systematic reviews report that lower airway dysfunction occurs in approximately 20–25% of athletes (26), while the prevalence of ADHD among elite athletes has been estimated at 7–8% (12). The masters athlete population is also expanding: the 2024 World Masters Athletics Championships registered 8,029 athletes from 112 countries (44), and the 2027 World Masters Games had already received more than 24,000 registrations more than a year before the event (15). These figures underscore that TUE policy decisions affect a large, heterogeneous population that includes younger elite competitors and older recreational athletes alike.</w:t>
       </w:r>
     </w:p>
     <w:p>
@@ -531,7 +531,7 @@
         <w:rPr>
           <w:sz w:val="24"/>
         </w:rPr>
-        <w:t>The Global Initiative for Asthma (GINA) 2025 report established a paradigm shift in asthma management, designating ICS-formoterol (inhaled corticosteroid combined with formoterol) maintenance and reliever therapy (MART) as the preferred treatment track (Track 1) across all severity steps (10). Under this approach, patients use a single ICS-formoterol inhaler for both daily maintenance and as-needed symptom relief, replacing the traditional model of a separate short-acting beta-2 agonist (SABA) reliever.</w:t>
+        <w:t>The Global Initiative for Asthma (GINA) 2025 report established a paradigm shift in asthma management, designating ICS-formoterol (inhaled corticosteroid combined with formoterol) maintenance and reliever therapy (MART) as the preferred treatment track (Track 1) across all severity steps (11). Under this approach, patients use a single ICS-formoterol inhaler for both daily maintenance and as-needed symptom relief, replacing the traditional model of a separate short-acting beta-2 agonist (SABA) reliever.</w:t>
       </w:r>
     </w:p>
     <w:p>
@@ -553,7 +553,7 @@
         <w:rPr>
           <w:sz w:val="24"/>
         </w:rPr>
-        <w:t>WADA's threshold policy for beta-2 agonists reflects meta-analytic evidence that systemic use of these agents can increase lean body mass and reduce fat mass, whereas inhaled routes at permitted doses are considered unlikely to produce these effects (13). This performance-enhancement rationale is independent of the clinical guideline rationale, which prioritizes symptom control and exacerbation prevention. The misalignment is not a contradiction of clinical asthma care, but it creates an unintended incentive for athletes to rely on SABA monotherapy—a practice GINA 2025 explicitly recommends against at any severity step because it increases the risk of severe exacerbations and asthma-related death (10).</w:t>
+        <w:t>WADA's threshold policy for beta-2 agonists reflects meta-analytic evidence that systemic use of these agents can increase lean body mass and reduce fat mass, whereas inhaled routes at permitted doses are considered unlikely to produce these effects (14). This performance-enhancement rationale is independent of the clinical guideline rationale, which prioritizes symptom control and exacerbation prevention. The misalignment is not a contradiction of clinical asthma care, but it creates an unintended incentive for athletes to rely on SABA monotherapy—a practice GINA 2025 explicitly recommends against at any severity step because it increases the risk of severe exacerbations and asthma-related death (11).</w:t>
       </w:r>
     </w:p>
     <w:p>
@@ -587,7 +587,7 @@
         <w:rPr>
           <w:sz w:val="24"/>
         </w:rPr>
-        <w:t>Major clinical guidelines, including NICE 2024 and the Australian ADHD Guideline 2022, designate stimulant medications as first-line pharmacotherapy for ADHD in both children and adults (4, 20). Methylphenidate and lisdexamfetamine/amphetamine preparations consistently demonstrate the largest effect sizes and highest response rates among available treatments. Non-stimulant alternatives (atomoxetine, guanfacine) are positioned as second-line agents, with approximately 30–40% of patients showing an inadequate response (4).</w:t>
+        <w:t>Major clinical guidelines, including NICE 2024 and the Australian ADHD Guideline 2022, designate stimulant medications as first-line pharmacotherapy for ADHD in both children and adults (4, 22). Methylphenidate and lisdexamfetamine/amphetamine preparations consistently demonstrate the largest effect sizes and highest response rates among available treatments. Non-stimulant alternatives (atomoxetine, guanfacine) are positioned as second-line agents, with approximately 30–40% of patients showing an inadequate response (4).</w:t>
       </w:r>
     </w:p>
     <w:p>
@@ -598,7 +598,7 @@
         <w:rPr>
           <w:sz w:val="24"/>
         </w:rPr>
-        <w:t>Under WADA regulations, all stimulant medications for ADHD are prohibited in-competition: amphetamines as non-specified stimulants (S6.A) and methylphenidate as a specified stimulant (S6.B) (35). Notably, these substances are permitted out-of-competition. WADA's rationale for the in-competition ban is that stimulants may acutely improve alertness, vigilance, and concentration, which could confer a competitive advantage; out-of-competition use is permitted because treatment continuity is clinically necessary and detection windows are shorter outside events (11, 35). This creates a fundamental paradox: ADHD is a continuous neurodevelopmental condition that does not remit on competition days, yet WADA's regulatory framework treats it as if pharmacotherapy can be safely interrupted for competitive events. Long-acting formulations such as extended-release methylphenidate and lisdexamfetamine are specifically designed to provide consistent 10–14 hour coverage, and abrupt discontinuation can produce withdrawal symptoms and acute cognitive deterioration (37).</w:t>
+        <w:t>Under WADA regulations, all stimulant medications for ADHD are prohibited in-competition: amphetamines as non-specified stimulants (S6.A) and methylphenidate as a specified stimulant (S6.B) (35). Notably, these substances are permitted out-of-competition. WADA's rationale for the in-competition ban is that stimulants may acutely improve alertness, vigilance, and concentration, which could confer a competitive advantage; out-of-competition use is permitted because treatment continuity is clinically necessary and detection windows are shorter outside events (12, 35). This creates a fundamental paradox: ADHD is a continuous neurodevelopmental condition that does not remit on competition days, yet WADA's regulatory framework treats it as if pharmacotherapy can be safely interrupted for competitive events. Long-acting formulations such as extended-release methylphenidate and lisdexamfetamine are specifically designed to provide consistent 10–14 hour coverage, and abrupt discontinuation can produce withdrawal symptoms and acute cognitive deterioration (37).</w:t>
       </w:r>
     </w:p>
     <w:p>
@@ -620,7 +620,7 @@
         <w:rPr>
           <w:sz w:val="24"/>
         </w:rPr>
-        <w:t>The prevalence of ADHD among elite athletes has been estimated at 7–8%, comparable to or slightly higher than the general adult population prevalence (11). This suggests that the ADHD-TUE gap affects a substantial number of competitive athletes worldwide. Data from Vernec et al. (32) indicate that stimulant TUE applications have increased steadily at recent Olympic Games, reflecting growing diagnostic awareness. However, the administrative burden of the TUE process may lead to significant underreporting, with athletes choosing to forgo treatment rather than navigate the complex application requirements. The safety implications of untreated or undertreated ADHD during training and competition—including impaired concentration, impulsivity, and increased injury risk—represent a direct concern for S&amp;C professionals supervising training sessions.</w:t>
+        <w:t>The prevalence of ADHD among elite athletes has been estimated at 7–8%, comparable to or slightly higher than the general adult population prevalence (12). This suggests that the ADHD-TUE gap affects a substantial number of competitive athletes worldwide. Data from Vernec et al. (32) indicate that stimulant TUE applications have increased steadily at recent Olympic Games, reflecting growing diagnostic awareness. However, the administrative burden of the TUE process may lead to significant underreporting, with athletes choosing to forgo treatment rather than navigate the complex application requirements. The safety implications of untreated or undertreated ADHD during training and competition—including impaired concentration, impulsivity, and increased injury risk—represent a direct concern for S&amp;C professionals supervising training sessions.</w:t>
       </w:r>
     </w:p>
     <w:p>
@@ -631,7 +631,7 @@
         <w:rPr>
           <w:sz w:val="24"/>
         </w:rPr>
-        <w:t>TUE access for stimulant medications is not uniformly available across all competitive tiers. While the ISTUE applies in principle to all athletes subject to anti-doping rules, practical implementation varies by NADO and IF. Some NADOs require proof of national-team status, international results, or prior anti-doping testing before accepting TUE applications; others accept applications at any competitive level but impose documentation and processing requirements that function as de facto barriers (21, 32, 34). Emerging athletes diagnosed with ADHD therefore face compounded barriers: limited access to the TUE pathway, limited access to physicians with expertise in both anti-doping regulations and ADHD pharmacotherapy, and the psychological stress of navigating a system that may ultimately deny them guideline-directed first-line pharmacotherapy.</w:t>
+        <w:t>TUE access for stimulant medications is not uniformly available across all competitive tiers. While the ISTUE applies in principle to all athletes subject to anti-doping rules, practical implementation varies by NADO and IF. Some NADOs require proof of national-team status, international results, or prior anti-doping testing before accepting TUE applications; others accept applications at any competitive level but impose documentation and processing requirements that function as de facto barriers (23, 32, 34). Emerging athletes diagnosed with ADHD therefore face compounded barriers: limited access to the TUE pathway, limited access to physicians with expertise in both anti-doping regulations and ADHD pharmacotherapy, and the psychological stress of navigating a system that may ultimately deny them guideline-directed first-line pharmacotherapy.</w:t>
       </w:r>
     </w:p>
     <w:p>
@@ -665,7 +665,7 @@
         <w:rPr>
           <w:sz w:val="24"/>
         </w:rPr>
-        <w:t>Semaglutide (Ozempic) received US Food and Drug Administration approval in December 2017, European Medicines Agency authorization in February 2018, and Pharmaceuticals and Medical Devices Agency approval in March 2018 for type 2 diabetes (8, 22, 29). Tirzepatide (Mounjaro) received FDA approval in May 2022, EMA authorization in September 2022, and PMDA approval in April 2023 for type 2 diabetes (9, 23, 30). This rapid multinational uptake means that many athletes with type 2 diabetes are now treated with agents that may also be attractive for misuse because of their weight-loss effects.</w:t>
+        <w:t>Semaglutide (Ozempic) received US Food and Drug Administration approval in December 2017, European Medicines Agency authorization in February 2018, and Pharmaceuticals and Medical Devices Agency approval in March 2018 for type 2 diabetes (8, 24, 30). Tirzepatide (Mounjaro) received FDA approval in May 2022, EMA authorization in September 2022, and PMDA approval in April 2023 for type 2 diabetes (9, 25, 31). This rapid multinational uptake means that many athletes with type 2 diabetes are now treated with agents that may also be attractive for misuse because of their weight-loss effects.</w:t>
       </w:r>
     </w:p>
     <w:p>
@@ -710,7 +710,7 @@
         <w:rPr>
           <w:sz w:val="24"/>
         </w:rPr>
-        <w:t>The discrepancy between clinical and anti-doping standards is perhaps most pronounced in male hypogonadism. The Endocrine Society 2018 clinical practice guideline recommends testosterone replacement therapy (TRT) for men with consistently low testosterone levels (&lt;300 ng/dL on two morning measurements) accompanied by symptoms, without mandating that the etiology be exclusively organic (5). The EAU 2024 guidelines similarly recognize late-onset hypogonadism (LOH) as a treatable condition when lifestyle modifications fail to restore testosterone levels (7). The TRAVERSE trial 2023 provided landmark evidence that TRT does not increase major adverse cardiovascular events in men aged 45–80 with hypogonadism, removing a major historical safety concern (16).</w:t>
+        <w:t>The discrepancy between clinical and anti-doping standards is perhaps most pronounced in male hypogonadism. The Endocrine Society 2018 clinical practice guideline recommends testosterone replacement therapy (TRT) for men with consistently low testosterone levels (&lt;300 ng/dL on two morning measurements) accompanied by symptoms, without mandating that the etiology be exclusively organic (5). The EAU 2024 guidelines similarly recognize late-onset hypogonadism (LOH) as a treatable condition when lifestyle modifications fail to restore testosterone levels (7). The TRAVERSE trial 2023 provided landmark evidence that TRT does not increase major adverse cardiovascular events in men aged 45–80 with hypogonadism, removing a major historical safety concern (18).</w:t>
       </w:r>
     </w:p>
     <w:p>
@@ -743,7 +743,7 @@
         <w:rPr>
           <w:sz w:val="24"/>
         </w:rPr>
-        <w:t>The growing masters athlete population is disproportionately affected by this gap. A study of 183 male athletes older than 50 years found that 11.5% had severe testosterone deficiency (&lt;8 nmol/L) and 26.2% had mild deficiency (8–12 nmol/L), with prevalence rising with age (6). The 2024 World Masters Athletics Championships registered 8,029 athletes (44), and the 2027 World Masters Games had more than 24,000 registrants (14). These data indicate that a large and growing population of older competitive athletes may meet clinical criteria for TRT while failing WADA's organic-only TUE criterion. A 52-year-old masters track athlete with documented LOH (testosterone 220 ng/dL on two occasions), persistent symptoms despite six months of lifestyle modification, and an endocrinologist's TRT recommendation faces an irreconcilable conflict between evidence-based medicine and anti-doping compliance (5, 36).</w:t>
+        <w:t>The growing masters athlete population is disproportionately affected by this gap. A study of 183 male athletes older than 50 years found that 11.5% had severe testosterone deficiency (&lt;8 nmol/L) and 26.2% had mild deficiency (8–12 nmol/L), with prevalence rising with age (6). The 2024 World Masters Athletics Championships registered 8,029 athletes (44), and the 2027 World Masters Games had more than 24,000 registrants (15). These data indicate that a large and growing population of older competitive athletes may meet clinical criteria for TRT while failing WADA's organic-only TUE criterion. A 52-year-old masters track athlete with documented LOH (testosterone 220 ng/dL on two occasions), persistent symptoms despite six months of lifestyle modification, and an endocrinologist's TRT recommendation faces an irreconcilable conflict between evidence-based medicine and anti-doping compliance (5, 36).</w:t>
       </w:r>
     </w:p>
     <w:p>
@@ -754,7 +754,7 @@
         <w:rPr>
           <w:sz w:val="24"/>
         </w:rPr>
-        <w:t>The implications for training and performance are substantial. Untreated or undertreated hypogonadism is associated with decreased lean body mass, increased fat mass, reduced bone mineral density, impaired recovery from training, persistent fatigue, decreased motivation, and depressive symptoms (5). For S&amp;C professionals, these symptoms may manifest as unexplained performance plateaus, difficulty maintaining training loads, prolonged soreness after sessions, and decreased training adherence. The ethical dimension is also noteworthy: denying an athlete access to a treatment considered standard of care in the general population raises questions about the proportionality of anti-doping measures, particularly when the goal of TRT is restoration to normal physiological range rather than supraphysiological enhancement (16).</w:t>
+        <w:t>The implications for training and performance are substantial. Untreated or undertreated hypogonadism is associated with decreased lean body mass, increased fat mass, reduced bone mineral density, impaired recovery from training, persistent fatigue, decreased motivation, and depressive symptoms (5). For S&amp;C professionals, these symptoms may manifest as unexplained performance plateaus, difficulty maintaining training loads, prolonged soreness after sessions, and decreased training adherence. The ethical dimension is also noteworthy: denying an athlete access to a treatment considered standard of care in the general population raises questions about the proportionality of anti-doping measures, particularly when the goal of TRT is restoration to normal physiological range rather than supraphysiological enhancement (18).</w:t>
       </w:r>
     </w:p>
     <w:p>
@@ -811,7 +811,7 @@
         <w:rPr>
           <w:sz w:val="24"/>
         </w:rPr>
-        <w:t>Heart failure management, as outlined in the 2021 ESC Guidelines and subsequent updates, relies on four foundational drug classes: ACE inhibitors/ARNi, beta-blockers, mineralocorticoid receptor antagonists (MRAs such as spironolactone and eplerenone), and SGLT2 inhibitors (18). Of these, MRAs are prohibited under WADA category S5 (diuretics and masking agents), as are loop diuretics (furosemide) essential for congestion management and thiazide diuretics used in hypertension treatment (17, 35).</w:t>
+        <w:t>Heart failure management, as outlined in the 2021 ESC Guidelines and subsequent updates, relies on four foundational drug classes: ACE inhibitors/ARNi, beta-blockers, mineralocorticoid receptor antagonists (MRAs such as spironolactone and eplerenone), and SGLT2 inhibitors (20). Of these, MRAs are prohibited under WADA category S5 (diuretics and masking agents), as are loop diuretics (furosemide) essential for congestion management and thiazide diuretics used in hypertension treatment (19, 35).</w:t>
       </w:r>
     </w:p>
     <w:p>
@@ -822,7 +822,7 @@
         <w:rPr>
           <w:sz w:val="24"/>
         </w:rPr>
-        <w:t>The blanket prohibition of all diuretics is based on their potential as masking agents. Advanced heart failure generally precludes elite competitive sport, but athletes with earlier-stage or stable heart failure, as well as masters and recreational competitors, may be prescribed MRAs. In such cases, the athlete must either forgo a pillar of standard therapy or navigate the TUE process for spironolactone. Beta-blockers, while not universally prohibited, are banned in-competition in precision sports (shooting, archery, golf, billiards, automotive sports). WADA's rationale for prohibiting beta-blockers in these sports is that they reduce tremor and may steady the hand, effects that could directly improve competitive performance (35). A masters shooting athlete diagnosed with atrial fibrillation faces particular difficulty, as beta-blockers are first-line rate control therapy, yet CAS precedents from 2009 and 2013 have established a high bar for TUE approval in sports where these agents could reduce tremor (18, 35).</w:t>
+        <w:t>The blanket prohibition of all diuretics is based on their potential as masking agents. Advanced heart failure generally precludes elite competitive sport, but athletes with earlier-stage or stable heart failure, as well as masters and recreational competitors, may be prescribed MRAs. In such cases, the athlete must either forgo a pillar of standard therapy or navigate the TUE process for spironolactone. Beta-blockers, while not universally prohibited, are banned in-competition in precision sports (shooting, archery, golf, billiards, automotive sports). WADA's rationale for prohibiting beta-blockers in these sports is that they reduce tremor and may steady the hand, effects that could directly improve competitive performance (35). A masters shooting athlete diagnosed with atrial fibrillation faces particular difficulty, as beta-blockers are first-line rate control therapy, yet CAS precedents from 2009 and 2013 have established a high bar for TUE approval in sports where these agents could reduce tremor (20, 35).</w:t>
       </w:r>
     </w:p>
     <w:p>
@@ -845,7 +845,7 @@
         <w:rPr>
           <w:sz w:val="24"/>
         </w:rPr>
-        <w:t>In May 2026, an international panel proposed renaming polycystic ovary syndrome (PCOS) to polyendocrine metabolic ovarian syndrome (PMOS) to better reflect its heterogeneous endocrine, metabolic, and reproductive features (27). We have adopted this proposed terminology throughout this review while retaining PCOS in parentheses for reader recognition.</w:t>
+        <w:t>In May 2026, an international panel proposed renaming polycystic ovary syndrome (PCOS) to polyendocrine metabolic ovarian syndrome (PMOS) to better reflect its heterogeneous endocrine, metabolic, and reproductive features (28). We have adopted this proposed terminology throughout this review while retaining PCOS in parentheses for reader recognition.</w:t>
       </w:r>
     </w:p>
     <w:p>
@@ -856,7 +856,7 @@
         <w:rPr>
           <w:sz w:val="24"/>
         </w:rPr>
-        <w:t>The 2023 International Evidence-Based PCOS Guideline and WHO recommendations position letrozole as the first-line ovulation induction agent for PMOS-related infertility, with clomiphene as second-line (26). Both agents are always prohibited under WADA category S4 (anti-estrogens and aromatase inhibitors) (35). WADA's rationale is that aromatase inhibitors and selective estrogen receptor modulators may be misused to mitigate estrogenic effects of anabolic-androgenic steroid use or to restore endogenous testosterone production (35). Spironolactone, recommended for PMOS-associated hirsutism, is prohibited as a diuretic (S5). Female athletes pursuing fertility treatment must obtain a TUE for time-limited, cycle-specific medication use, requiring disclosure of private reproductive health information to sporting authorities—a privacy concern that may deter athletes from seeking treatment (26, 36).</w:t>
+        <w:t>The 2023 International Evidence-Based PCOS Guideline and WHO recommendations position letrozole as the first-line ovulation induction agent for PMOS-related infertility, with clomiphene as second-line (27). Both agents are always prohibited under WADA category S4 (anti-estrogens and aromatase inhibitors) (35). WADA's rationale is that aromatase inhibitors and selective estrogen receptor modulators may be misused to mitigate estrogenic effects of anabolic-androgenic steroid use or to restore endogenous testosterone production (35). Spironolactone, recommended for PMOS-associated hirsutism, is prohibited as a diuretic (S5). Female athletes pursuing fertility treatment must obtain a TUE for time-limited, cycle-specific medication use, requiring disclosure of private reproductive health information to sporting authorities—a privacy concern that may deter athletes from seeking treatment (27, 36).</w:t>
       </w:r>
     </w:p>
     <w:p>
@@ -890,7 +890,7 @@
         <w:rPr>
           <w:sz w:val="24"/>
         </w:rPr>
-        <w:t>WADA has developed tools to address the misuse of prohibited substances while preserving athlete health, including the Athlete Biological Passport (ABP) for longitudinal monitoring of hematological and steroidal variables and the Anti-Doping Administration and Management System (ADAMS) for TUE submission and sample administration (42, 43). These systems are not anti-athlete; they are designed to protect clean sport. However, accessibility and digital literacy vary across NADOs, and ABP reference ranges may flag physiological restoration achieved through TRT as suspicious, reinforcing the tension between clinical treatment and anti-doping enforcement. The temporal mismatch is particularly well illustrated by comparing update frequencies. GINA has published annual updates every year since 2014, with major revisions in 2019 and 2025. The ADA Standards of Care is updated annually. In contrast, some WADA TUE Physician Guidelines have remained unchanged for 3–4 years despite significant clinical developments in the corresponding disease area. This creates a window during which newly recommended first-line therapies may conflict with TUE guidance that has not yet incorporated the new evidence (35, 36).</w:t>
+        <w:t>WADA has developed tools to address the misuse of prohibited substances while preserving athlete health, including the Athlete Biological Passport (ABP) for longitudinal monitoring of hematological and steroidal variables and the Anti-Doping Administration and Management System (ADAMS) for TUE submission and sample administration (42, 43). These systems are not anti-athlete; they are designed to protect clean sport. However, accessibility and digital literacy vary across NADOs, and ABP reference ranges may flag physiological restoration achieved through TRT as suspicious, reinforcing the tension between clinical treatment and anti-doping enforcement. The temporal mismatch is particularly well illustrated by comparing update frequencies. GINA has published annual updates every year since 2014, with major revisions in 2019 and 2025. The ADA Standards of Care is updated annually. In contrast, some WADA TUE Physician Guidelines have remained unchanged for 3–4 years despite significant clinical developments in the corresponding disease area. This creates a window during which newly recommended first-line therapies may conflict with TUE guidance that has not yet incorporated the new evidence (35, 36). These structural drivers and their interactions are summarized in the conceptual framework (Figure 4).</w:t>
       </w:r>
     </w:p>
     <w:p>
@@ -924,7 +924,7 @@
         <w:rPr>
           <w:sz w:val="24"/>
         </w:rPr>
-        <w:t>The implications of these gaps extend beyond regulatory inconvenience. Athletes may receive suboptimal medical care when clinicians, aware of anti-doping constraints, prescribe second-line agents to avoid TUE complexity. The TUE process itself, while necessary, imposes time, financial, and privacy burdens that may deter athletes from seeking appropriate treatment—particularly in conditions such as ADHD or PMOS where stigma compounds procedural barriers. Geographic disparities in TUE access further exacerbate these issues, as athletes in resource-limited settings face greater difficulty obtaining specialist evaluations and documentation required for TUE applications (21, 32, 34).</w:t>
+        <w:t>The implications of these gaps extend beyond regulatory inconvenience. Athletes may receive suboptimal medical care when clinicians, aware of anti-doping constraints, prescribe second-line agents to avoid TUE complexity. The TUE process itself, while necessary, imposes time, financial, and privacy burdens that may deter athletes from seeking appropriate treatment—particularly in conditions such as ADHD or PMOS where stigma compounds procedural barriers. Geographic disparities in TUE access further exacerbate these issues, as athletes in resource-limited settings face greater difficulty obtaining specialist evaluations and documentation required for TUE applications (23, 32, 34).</w:t>
       </w:r>
     </w:p>
     <w:p>
@@ -946,7 +946,7 @@
         <w:rPr>
           <w:sz w:val="24"/>
         </w:rPr>
-        <w:t>The concept of "no additional performance enhancement beyond restoring normal health" is inherently challenging to operationalize. For testosterone replacement, even physiological-range restoration may influence body composition and recovery. For stimulant medications in ADHD, delineating cognitive normalization from enhancement is conceptually problematic. For beta-2 agonists, the boundary between bronchodilation and potential systemic anabolic effects remains debated, and WADA's thresholds are set at doses considered unlikely to confer an unfair advantage (13). These ambiguities create uncertainty for both clinicians and TUE committees, potentially leading to inconsistent decisions across jurisdictions.</w:t>
+        <w:t>The concept of "no additional performance enhancement beyond restoring normal health" is inherently challenging to operationalize. For testosterone replacement, even physiological-range restoration may influence body composition and recovery. For stimulant medications in ADHD, delineating cognitive normalization from enhancement is conceptually problematic. For beta-2 agonists, the boundary between bronchodilation and potential systemic anabolic effects remains debated, and WADA's thresholds are set at doses considered unlikely to confer an unfair advantage (14). These ambiguities create uncertainty for both clinicians and TUE committees, potentially leading to inconsistent decisions across jurisdictions.</w:t>
       </w:r>
     </w:p>
     <w:p>
@@ -957,7 +957,7 @@
         <w:rPr>
           <w:sz w:val="24"/>
         </w:rPr>
-        <w:t>The findings of this review align with and extend previous work. Heuberger and Cohen (12) found limited evidence for performance-enhancing effects of many prohibited substances, raising questions about the scientific basis for some prohibitions. Our analysis adds a clinical dimension to this concern by demonstrating that prohibition of specific agents creates measurable gaps in patient care. Stuart et al. (25) documented increasing TUE application volumes, which our disease-specific analysis helps to contextualize—the growing burden reflects both increased awareness and the expanding scope of conditions affected by clinical-competition gaps. The geographic disparities in TUE access reported by Vernec et al. (32) take on additional significance when considered alongside our finding that some disease areas (e.g., ADHD, hypogonadism) require particularly complex and well-documented TUE applications.</w:t>
+        <w:t>The findings of this review align with and extend previous work. Heuberger and Cohen (13) found limited evidence for performance-enhancing effects of many prohibited substances, raising questions about the scientific basis for some prohibitions. Our analysis adds a clinical dimension to this concern by demonstrating that prohibition of specific agents creates measurable gaps in patient care. Data from the International Testing Agency (ITA) TUE dashboard (16) show that TUE application volumes managed by the ITA increased from approximately 650 in 2023 to 850 in 2025, which our disease-specific analysis helps to contextualize—the growing burden reflects both increased awareness and the expanding scope of conditions affected by clinical-competition gaps. The geographic disparities in TUE access reported by Vernec et al. (32) take on additional significance when considered alongside our finding that some disease areas (e.g., ADHD, hypogonadism) require particularly complex and well-documented TUE applications.</w:t>
       </w:r>
     </w:p>
     <w:p>
@@ -1402,7 +1402,7 @@
         <w:rPr>
           <w:sz w:val="20"/>
         </w:rPr>
-        <w:t>10. Global Initiative for Asthma. Global Strategy for Asthma Management and Prevention. Fontana, WI: GINA; 2025.</w:t>
+        <w:t>10. Gerrard D, Pipe A. Therapeutic use exemptions. Med Sport Sci. 2017;62:55–67.</w:t>
       </w:r>
     </w:p>
     <w:p>
@@ -1414,7 +1414,7 @@
         <w:rPr>
           <w:sz w:val="20"/>
         </w:rPr>
-        <w:t>11. Han DH, McDuff D, Thompson D, et al. Attention-deficit/hyperactivity disorder in elite athletes: a narrative review. Br J Sports Med. 2019;53(12):741–747.</w:t>
+        <w:t>11. Global Initiative for Asthma. Global Strategy for Asthma Management and Prevention. Fontana, WI: GINA; 2025.</w:t>
       </w:r>
     </w:p>
     <w:p>
@@ -1426,7 +1426,7 @@
         <w:rPr>
           <w:sz w:val="20"/>
         </w:rPr>
-        <w:t>12. Heuberger JAAC, Cohen AF. Review of WADA prohibited substances: limited evidence for performance-enhancing effects. Sports Med. 2019;49(4):525–539.</w:t>
+        <w:t>12. Han DH, McDuff D, Thompson D, et al. Attention-deficit/hyperactivity disorder in elite athletes: a narrative review. Br J Sports Med. 2019;53(12):741–747.</w:t>
       </w:r>
     </w:p>
     <w:p>
@@ -1438,7 +1438,7 @@
         <w:rPr>
           <w:sz w:val="20"/>
         </w:rPr>
-        <w:t>13. Hostrup M, Jacobson GA, Jessen S, Lemminger AK. Beta2-adrenoceptor agonist doping of athletes: a systematic review and meta-analysis of performance-enhancing effects. Br J Sports Med. 2020;54(22):1348–1356.</w:t>
+        <w:t>13. Heuberger JAAC, Cohen AF. Review of WADA prohibited substances: limited evidence for performance-enhancing effects. Sports Med. 2019;49(4):525–539.</w:t>
       </w:r>
     </w:p>
     <w:p>
@@ -1450,7 +1450,7 @@
         <w:rPr>
           <w:sz w:val="20"/>
         </w:rPr>
-        <w:t>14. International Masters Games Association. Record registrations: already over 24,000 athletes joining World Masters Games. 2026.</w:t>
+        <w:t>14. Hostrup M, Jacobson GA, Jessen S, Lemminger AK. Beta2-adrenoceptor agonist doping of athletes: a systematic review and meta-analysis of performance-enhancing effects. Br J Sports Med. 2020;54(22):1348–1356.</w:t>
       </w:r>
     </w:p>
     <w:p>
@@ -1462,7 +1462,7 @@
         <w:rPr>
           <w:sz w:val="20"/>
         </w:rPr>
-        <w:t>15. Levac D, Colquhoun H, O'Brien KK. Scoping studies: advancing the methodology. Implement Sci. 2010;5:69.</w:t>
+        <w:t>15. International Masters Games Association. Record registrations: already over 24,000 athletes joining World Masters Games. 2026.</w:t>
       </w:r>
     </w:p>
     <w:p>
@@ -1474,7 +1474,7 @@
         <w:rPr>
           <w:sz w:val="20"/>
         </w:rPr>
-        <w:t>16. Lincoff AM, Bhasin S, Flevaris P, et al. Cardiovascular safety of testosterone-replacement therapy. N Engl J Med. 2023;389(2):107–117.</w:t>
+        <w:t>16. International Testing Agency. Behind the numbers: ITA publishes TUE dashboard to strengthen transparency in the global fight against doping in sport. 2026 Mar 17. Available at: https://ita.sport/news/behind-the-numbers-ita-publishes-tue-dashboard-to-strengthen-transparency-in-the-global-fight-against-doping-in-sport/</w:t>
       </w:r>
     </w:p>
     <w:p>
@@ -1486,7 +1486,7 @@
         <w:rPr>
           <w:sz w:val="20"/>
         </w:rPr>
-        <w:t>17. Mancia G, Kreutz R, Brunstrom M, et al. 2023 ESH Guidelines for the management of arterial hypertension. J Hypertens. 2023;41(12):1874–2071.</w:t>
+        <w:t>17. Levac D, Colquhoun H, O'Brien KK. Scoping studies: advancing the methodology. Implement Sci. 2010;5:69.</w:t>
       </w:r>
     </w:p>
     <w:p>
@@ -1498,7 +1498,7 @@
         <w:rPr>
           <w:sz w:val="20"/>
         </w:rPr>
-        <w:t>18. McDonagh TA, Metra M, Adamo M, et al. 2021 ESC Guidelines for the diagnosis and treatment of acute and chronic heart failure. Eur Heart J. 2021;42(36):3599–3726.</w:t>
+        <w:t>18. Lincoff AM, Bhasin S, Flevaris P, et al. Cardiovascular safety of testosterone-replacement therapy. N Engl J Med. 2023;389(2):107–117.</w:t>
       </w:r>
     </w:p>
     <w:p>
@@ -1510,7 +1510,7 @@
         <w:rPr>
           <w:sz w:val="20"/>
         </w:rPr>
-        <w:t>19. Munn Z, Peters MDJ, Stern C, Tufanaru C, McArthur A, Aromataris E. Systematic review or scoping review? Guidance for authors when choosing between a systematic or scoping review approach. BMC Med Res Methodol. 2018;18(1):143.</w:t>
+        <w:t>19. Mancia G, Kreutz R, Brunstrom M, et al. 2023 ESH Guidelines for the management of arterial hypertension. J Hypertens. 2023;41(12):1874–2071.</w:t>
       </w:r>
     </w:p>
     <w:p>
@@ -1522,7 +1522,7 @@
         <w:rPr>
           <w:sz w:val="20"/>
         </w:rPr>
-        <w:t>20. National Institute for Health and Care Excellence. Attention deficit hyperactivity disorder: diagnosis and management. NICE guideline [NG87]. London: NICE; 2024 (updated).</w:t>
+        <w:t>20. McDonagh TA, Metra M, Adamo M, et al. 2021 ESC Guidelines for the diagnosis and treatment of acute and chronic heart failure. Eur Heart J. 2021;42(36):3599–3726.</w:t>
       </w:r>
     </w:p>
     <w:p>
@@ -1534,7 +1534,7 @@
         <w:rPr>
           <w:sz w:val="20"/>
         </w:rPr>
-        <w:t>21. Overbye M, Wagner U. Experiences, attitudes and knowledge of elite athletes regarding anti-doping—insights from a cross-national study. Eur J Sport Sci. 2014;14(Suppl 1):S149–S160.</w:t>
+        <w:t>21. Munn Z, Peters MDJ, Stern C, Tufanaru C, McArthur A, Aromataris E. Systematic review or scoping review? Guidance for authors when choosing between a systematic or scoping review approach. BMC Med Res Methodol. 2018;18(1):143.</w:t>
       </w:r>
     </w:p>
     <w:p>
@@ -1546,7 +1546,7 @@
         <w:rPr>
           <w:sz w:val="20"/>
         </w:rPr>
-        <w:t>22. Pharmaceuticals and Medical Devices Agency. Approval of Ozempic subcutaneous injection. 2018 Mar 20.</w:t>
+        <w:t>22. National Institute for Health and Care Excellence. Attention deficit hyperactivity disorder: diagnosis and management. NICE guideline [NG87]. London: NICE; 2024 (updated).</w:t>
       </w:r>
     </w:p>
     <w:p>
@@ -1558,7 +1558,7 @@
         <w:rPr>
           <w:sz w:val="20"/>
         </w:rPr>
-        <w:t>23. Pharmaceuticals and Medical Devices Agency. Approval of Mounjaro subcutaneous injection. 2023 Apr.</w:t>
+        <w:t>23. Overbye M, Wagner U. Between medical treatment and performance enhancement: an investigation of how elite athletes experience therapeutic use exemptions. Int J Drug Policy. 2013;24(6):579–588.</w:t>
       </w:r>
     </w:p>
     <w:p>
@@ -1570,7 +1570,7 @@
         <w:rPr>
           <w:sz w:val="20"/>
         </w:rPr>
-        <w:t>24. Price OJ, Sewry N, Schwellnus M, et al. Prevalence of lower airway dysfunction in athletes: a systematic review and meta-analysis. Br J Sports Med. 2022;56(4):213–222.</w:t>
+        <w:t>24. Pharmaceuticals and Medical Devices Agency. Approval of Ozempic subcutaneous injection. 2018 Mar 20.</w:t>
       </w:r>
     </w:p>
     <w:p>
@@ -1582,7 +1582,7 @@
         <w:rPr>
           <w:sz w:val="20"/>
         </w:rPr>
-        <w:t>25. Stuart M, Mottram DR, Erskine PJ. Therapeutic use exemptions—a review and analysis of TUE application trends across Olympic sports from 2015 to 2020. Drug Test Anal. 2022;14(5):890–898.</w:t>
+        <w:t>25. Pharmaceuticals and Medical Devices Agency. Approval of Mounjaro subcutaneous injection. 2023 Apr.</w:t>
       </w:r>
     </w:p>
     <w:p>
@@ -1594,7 +1594,7 @@
         <w:rPr>
           <w:sz w:val="20"/>
         </w:rPr>
-        <w:t>26. Teede HJ, Tay CT, Laven JJE, et al. Recommendations from the 2023 international evidence-based guideline for the assessment and management of polycystic ovary syndrome. J Clin Endocrinol Metab. 2023;108(10):2447–2469.</w:t>
+        <w:t>26. Price OJ, Sewry N, Schwellnus M, et al. Prevalence of lower airway dysfunction in athletes: a systematic review and meta-analysis. Br J Sports Med. 2022;56(4):213–222.</w:t>
       </w:r>
     </w:p>
     <w:p>
@@ -1606,7 +1606,7 @@
         <w:rPr>
           <w:sz w:val="20"/>
         </w:rPr>
-        <w:t>27. Teede HJ, Azziz R, Balen AH, et al. Polyendocrine metabolic ovarian syndrome: a proposal for the renaming of polycystic ovary syndrome. Lancet. 2026; published online May 13, 2026.</w:t>
+        <w:t>27. Teede HJ, Tay CT, Laven JJE, et al. Recommendations from the 2023 international evidence-based guideline for the assessment and management of polycystic ovary syndrome. J Clin Endocrinol Metab. 2023;108(10):2447–2469.</w:t>
       </w:r>
     </w:p>
     <w:p>
@@ -1618,7 +1618,7 @@
         <w:rPr>
           <w:sz w:val="20"/>
         </w:rPr>
-        <w:t>28. Tricco AC, Lillie E, Zarin W, et al. PRISMA extension for scoping reviews (PRISMA-ScR): checklist and explanation. Ann Intern Med. 2018;169(7):467–473.</w:t>
+        <w:t>28. Teede HJ, Azziz R, Balen AH, et al. Polyendocrine metabolic ovarian syndrome: a proposal for the renaming of polycystic ovary syndrome. Lancet. 2026; published online May 13, 2026.</w:t>
       </w:r>
     </w:p>
     <w:p>
@@ -1630,7 +1630,7 @@
         <w:rPr>
           <w:sz w:val="20"/>
         </w:rPr>
-        <w:t>29. US Food and Drug Administration. FDA approves Ozempic to improve glycemic control in adults with type 2 diabetes. Press release. 2017 Dec 4.</w:t>
+        <w:t>29. Tricco AC, Lillie E, Zarin W, et al. PRISMA extension for scoping reviews (PRISMA-ScR): checklist and explanation. Ann Intern Med. 2018;169(7):467–473.</w:t>
       </w:r>
     </w:p>
     <w:p>
@@ -1642,7 +1642,7 @@
         <w:rPr>
           <w:sz w:val="20"/>
         </w:rPr>
-        <w:t>30. US Food and Drug Administration. FDA approves Mounjaro (tirzepatide) injection for type 2 diabetes. Press release. 2022 May 13.</w:t>
+        <w:t>30. US Food and Drug Administration. FDA approves Ozempic to improve glycemic control in adults with type 2 diabetes. Press release. 2017 Dec 4.</w:t>
       </w:r>
     </w:p>
     <w:p>
@@ -1654,7 +1654,7 @@
         <w:rPr>
           <w:sz w:val="20"/>
         </w:rPr>
-        <w:t>31. Vernec A, Pipe A, Engel-Nitz NM. The World Anti-Doping Agency (WADA) Therapeutic Use Exemption (TUE) process. Clin J Sport Med. 2019;29(5):351–355.</w:t>
+        <w:t>31. US Food and Drug Administration. FDA approves Mounjaro (tirzepatide) injection for type 2 diabetes. Press release. 2022 May 13.</w:t>
       </w:r>
     </w:p>
     <w:p>

</xml_diff>